<commit_message>
Add final report documents
</commit_message>
<xml_diff>
--- a/rapor.docx
+++ b/rapor.docx
@@ -25,7 +25,15 @@
           <w:color w:val="595959"/>
           <w:sz w:val="20"/>
         </w:rPr>
-        <w:t>Bilgisayar Mühendisliği — Sistem Programlama 2025-2026 Bahar Dönemi Projesi  |  Teslim: 24 Mayıs 2026</w:t>
+        <w:t>SERHAT HAR G231210040 1A</w:t>
+      </w:r>
+      <w:r>
+        <w:rPr>
+          <w:i/>
+          <w:color w:val="595959"/>
+          <w:sz w:val="20"/>
+        </w:rPr>
+        <w:t xml:space="preserve"> — Sistem Programlama 2025-2026 Bahar Dönemi Projesi  |  Teslim: 24 Mayıs 2026</w:t>
       </w:r>
     </w:p>
     <w:p>
@@ -428,7 +436,6 @@
         <w:pStyle w:val="ListeMaddemi"/>
       </w:pPr>
       <w:r>
-        <w:lastRenderedPageBreak/>
         <w:t>Dizin parametresi verilmezse dosyalar mevcut dizine çıkartılır.</w:t>
       </w:r>
     </w:p>
@@ -440,6 +447,7 @@
         <w:rPr>
           <w:color w:val="2E4057"/>
         </w:rPr>
+        <w:lastRenderedPageBreak/>
         <w:t>3.3 .sau Dosya Formatı</w:t>
       </w:r>
     </w:p>
@@ -541,8 +549,12 @@
       </w:pPr>
       <w:r>
         <w:t>make                 # Linux / WSL</w:t>
+      </w:r>
+      <w:r>
         <w:br/>
         <w:t>make test            # unit testler</w:t>
+      </w:r>
+      <w:r>
         <w:br/>
         <w:t>gcc -Wall -Wextra -std=c11 -Iinclude -o tarsau src/main.c src/archive.c src/extract.c src/utils.c</w:t>
       </w:r>
@@ -701,7 +713,10 @@
           </w:tcPr>
           <w:p>
             <w:r>
-              <w:t>250</w:t>
+              <w:t>1</w:t>
+            </w:r>
+            <w:r>
+              <w:t>5000</w:t>
             </w:r>
           </w:p>
         </w:tc>
@@ -711,7 +726,10 @@
           </w:tcPr>
           <w:p>
             <w:r>
-              <w:t>250</w:t>
+              <w:t>1</w:t>
+            </w:r>
+            <w:r>
+              <w:t>5000</w:t>
             </w:r>
           </w:p>
         </w:tc>
@@ -756,7 +774,10 @@
           </w:tcPr>
           <w:p>
             <w:r>
-              <w:t>250</w:t>
+              <w:t>1</w:t>
+            </w:r>
+            <w:r>
+              <w:t>5000</w:t>
             </w:r>
           </w:p>
         </w:tc>
@@ -766,7 +787,10 @@
           </w:tcPr>
           <w:p>
             <w:r>
-              <w:t>250</w:t>
+              <w:t>1</w:t>
+            </w:r>
+            <w:r>
+              <w:t>5000</w:t>
             </w:r>
           </w:p>
         </w:tc>
@@ -788,7 +812,13 @@
         <w:jc w:val="center"/>
       </w:pPr>
       <w:r>
-        <w:t>Toplam: 500 rastgele seed çalışması - SIFIR HATA (23 Mayıs 2026 tarihinde doğrulandı).</w:t>
+        <w:t xml:space="preserve">Toplam: </w:t>
+      </w:r>
+      <w:r>
+        <w:t>15000</w:t>
+      </w:r>
+      <w:r>
+        <w:t xml:space="preserve"> rastgele seed çalışması - SIFIR HATA (23 Mayıs 2026 tarihinde doğrulandı).</w:t>
       </w:r>
     </w:p>
     <w:p>
@@ -1196,9 +1226,12 @@
         </w:tc>
       </w:tr>
       <w:tr>
+        <w:trPr>
+          <w:jc w:val="center"/>
+        </w:trPr>
         <w:tc>
           <w:tcPr>
-            <w:tcW w:type="dxa" w:w="4703"/>
+            <w:tcW w:w="4703" w:type="dxa"/>
           </w:tcPr>
           <w:p>
             <w:r>
@@ -1208,7 +1241,7 @@
         </w:tc>
         <w:tc>
           <w:tcPr>
-            <w:tcW w:type="dxa" w:w="4703"/>
+            <w:tcW w:w="4703" w:type="dxa"/>
           </w:tcPr>
           <w:p>
             <w:r>
@@ -1218,19 +1251,23 @@
         </w:tc>
       </w:tr>
       <w:tr>
+        <w:trPr>
+          <w:jc w:val="center"/>
+        </w:trPr>
         <w:tc>
           <w:tcPr>
-            <w:tcW w:type="dxa" w:w="4703"/>
+            <w:tcW w:w="4703" w:type="dxa"/>
           </w:tcPr>
           <w:p>
             <w:r>
+              <w:lastRenderedPageBreak/>
               <w:t>Dizin geçişi ve aynı dosya üzerine yazma koruması</w:t>
             </w:r>
           </w:p>
         </w:tc>
         <w:tc>
           <w:tcPr>
-            <w:tcW w:type="dxa" w:w="4703"/>
+            <w:tcW w:w="4703" w:type="dxa"/>
           </w:tcPr>
           <w:p>
             <w:r>
@@ -1240,9 +1277,12 @@
         </w:tc>
       </w:tr>
       <w:tr>
+        <w:trPr>
+          <w:jc w:val="center"/>
+        </w:trPr>
         <w:tc>
           <w:tcPr>
-            <w:tcW w:type="dxa" w:w="4703"/>
+            <w:tcW w:w="4703" w:type="dxa"/>
           </w:tcPr>
           <w:p>
             <w:r>
@@ -1252,7 +1292,7 @@
         </w:tc>
         <w:tc>
           <w:tcPr>
-            <w:tcW w:type="dxa" w:w="4703"/>
+            <w:tcW w:w="4703" w:type="dxa"/>
           </w:tcPr>
           <w:p>
             <w:r>

</xml_diff>